<commit_message>
[FIX] cv: correct upgrade count, dates, worker wording
Bring CVs and portfolio in line with confirmed facts: Enterprise
upgrades are now 16+ (was 14+), the Spanish textile Odoo v19 upgrade
was delivered in Feb 2026 (not 2024, which predates Odoo 19's
release), and worker isolation is described as Odoo workers. Odoo
uses its own prefork workers, not Gunicorn, so the old wording was
technically wrong and could be picked up in a technical interview.

DOCX CVs regenerated from the updated scripts.

Co-Authored-By: Claude Opus 5.5 <noreply@anthropic.com>
</commit_message>
<xml_diff>
--- a/Md_Niaj_Shahriar_Shishir_Senior_Project_Manager.docx
+++ b/Md_Niaj_Shahriar_Shishir_Senior_Project_Manager.docx
@@ -344,7 +344,7 @@
                 <w:color w:val="2563EB"/>
                 <w:sz w:val="12"/>
               </w:rPr>
-              <w:t>900+ MODULES &amp; 14+ UPGRADES</w:t>
+              <w:t>900+ MODULES &amp; 16+ UPGRADES</w:t>
             </w:r>
           </w:p>
         </w:tc>
@@ -855,7 +855,7 @@
           <w:color w:val="1E293B"/>
           <w:sz w:val="16"/>
         </w:rPr>
-        <w:t>Led 14+ major multi-version database upgrades (Odoo 13 to 19). Developed an AST-based schema extraction strategy to retain all historical custom fields, financial ledger records, and audit reports while retiring legacy technical debt.</w:t>
+        <w:t>Led 16+ major multi-version database upgrades (Odoo 13 to 19). Developed an AST-based schema extraction strategy to retain all historical custom fields, financial ledger records, and audit reports while retiring legacy technical debt.</w:t>
       </w:r>
     </w:p>
     <w:p>
@@ -1132,7 +1132,7 @@
           <w:color w:val="1E293B"/>
           <w:sz w:val="16"/>
         </w:rPr>
-        <w:t>Configured Nginx reverse proxy worker isolation to separate heavy external API sync and e-commerce traffic from internal administrative back-office Gunicorn workers, eliminating system downtime.</w:t>
+        <w:t>Configured Nginx reverse proxy worker isolation to separate heavy external API sync and e-commerce traffic from internal administrative back-office Odoo workers, eliminating system downtime.</w:t>
       </w:r>
     </w:p>
     <w:p>

</xml_diff>